<commit_message>
Add scripts for capturing and validating Jira + Zephyr Scale screenshots
- Created capture_extra.py to capture specific Zephyr Scale test cycles, plans, and reports.
- Developed capture_jira_screenshots.py for comprehensive screenshot capture of Jira and Zephyr Scale.
- Implemented capture_remaining.py to capture remaining screenshots for test scripts, cycles, and plans.
- Added capture_retry.py to recapture screenshots that may not have loaded fully.
- Introduced validate_screenshots.py to check for missing or low-quality screenshots.
- Created verify_screenshots.html for visual verification of captured screenshots against expected content.
</commit_message>
<xml_diff>
--- a/docs/coursework/testing-lab-cse455/CSE455_Assignment1_TestCases_GhulamMujtaba.docx
+++ b/docs/coursework/testing-lab-cse455/CSE455_Assignment1_TestCases_GhulamMujtaba.docx
@@ -109,7 +109,7 @@
       <w:r>
         <w:drawing>
           <wp:inline xmlns:a="http://schemas.openxmlformats.org/drawingml/2006/main" xmlns:pic="http://schemas.openxmlformats.org/drawingml/2006/picture">
-            <wp:extent cx="5669280" cy="2591038"/>
+            <wp:extent cx="5669280" cy="3543300"/>
             <wp:docPr id="1" name="Picture 1"/>
             <wp:cNvGraphicFramePr>
               <a:graphicFrameLocks noChangeAspect="1"/>
@@ -130,7 +130,7 @@
                   <pic:spPr>
                     <a:xfrm>
                       <a:off x="0" y="0"/>
-                      <a:ext cx="5669280" cy="2591038"/>
+                      <a:ext cx="5669280" cy="3543300"/>
                     </a:xfrm>
                     <a:prstGeom prst="rect"/>
                   </pic:spPr>
@@ -175,7 +175,7 @@
       <w:r>
         <w:drawing>
           <wp:inline xmlns:a="http://schemas.openxmlformats.org/drawingml/2006/main" xmlns:pic="http://schemas.openxmlformats.org/drawingml/2006/picture">
-            <wp:extent cx="5669280" cy="2591038"/>
+            <wp:extent cx="5669280" cy="3543300"/>
             <wp:docPr id="2" name="Picture 2"/>
             <wp:cNvGraphicFramePr>
               <a:graphicFrameLocks noChangeAspect="1"/>
@@ -196,7 +196,7 @@
                   <pic:spPr>
                     <a:xfrm>
                       <a:off x="0" y="0"/>
-                      <a:ext cx="5669280" cy="2591038"/>
+                      <a:ext cx="5669280" cy="3543300"/>
                     </a:xfrm>
                     <a:prstGeom prst="rect"/>
                   </pic:spPr>
@@ -241,7 +241,7 @@
       <w:r>
         <w:drawing>
           <wp:inline xmlns:a="http://schemas.openxmlformats.org/drawingml/2006/main" xmlns:pic="http://schemas.openxmlformats.org/drawingml/2006/picture">
-            <wp:extent cx="5669280" cy="2591038"/>
+            <wp:extent cx="5669280" cy="3543300"/>
             <wp:docPr id="3" name="Picture 3"/>
             <wp:cNvGraphicFramePr>
               <a:graphicFrameLocks noChangeAspect="1"/>
@@ -262,7 +262,7 @@
                   <pic:spPr>
                     <a:xfrm>
                       <a:off x="0" y="0"/>
-                      <a:ext cx="5669280" cy="2591038"/>
+                      <a:ext cx="5669280" cy="3543300"/>
                     </a:xfrm>
                     <a:prstGeom prst="rect"/>
                   </pic:spPr>
@@ -307,7 +307,7 @@
       <w:r>
         <w:drawing>
           <wp:inline xmlns:a="http://schemas.openxmlformats.org/drawingml/2006/main" xmlns:pic="http://schemas.openxmlformats.org/drawingml/2006/picture">
-            <wp:extent cx="5669280" cy="2591038"/>
+            <wp:extent cx="5669280" cy="3543300"/>
             <wp:docPr id="4" name="Picture 4"/>
             <wp:cNvGraphicFramePr>
               <a:graphicFrameLocks noChangeAspect="1"/>
@@ -328,7 +328,7 @@
                   <pic:spPr>
                     <a:xfrm>
                       <a:off x="0" y="0"/>
-                      <a:ext cx="5669280" cy="2591038"/>
+                      <a:ext cx="5669280" cy="3543300"/>
                     </a:xfrm>
                     <a:prstGeom prst="rect"/>
                   </pic:spPr>
@@ -373,7 +373,7 @@
       <w:r>
         <w:drawing>
           <wp:inline xmlns:a="http://schemas.openxmlformats.org/drawingml/2006/main" xmlns:pic="http://schemas.openxmlformats.org/drawingml/2006/picture">
-            <wp:extent cx="5669280" cy="2591038"/>
+            <wp:extent cx="5669280" cy="3543300"/>
             <wp:docPr id="5" name="Picture 5"/>
             <wp:cNvGraphicFramePr>
               <a:graphicFrameLocks noChangeAspect="1"/>
@@ -394,7 +394,7 @@
                   <pic:spPr>
                     <a:xfrm>
                       <a:off x="0" y="0"/>
-                      <a:ext cx="5669280" cy="2591038"/>
+                      <a:ext cx="5669280" cy="3543300"/>
                     </a:xfrm>
                     <a:prstGeom prst="rect"/>
                   </pic:spPr>
@@ -439,7 +439,7 @@
       <w:r>
         <w:drawing>
           <wp:inline xmlns:a="http://schemas.openxmlformats.org/drawingml/2006/main" xmlns:pic="http://schemas.openxmlformats.org/drawingml/2006/picture">
-            <wp:extent cx="5669280" cy="2591038"/>
+            <wp:extent cx="5669280" cy="3543300"/>
             <wp:docPr id="6" name="Picture 6"/>
             <wp:cNvGraphicFramePr>
               <a:graphicFrameLocks noChangeAspect="1"/>
@@ -460,7 +460,7 @@
                   <pic:spPr>
                     <a:xfrm>
                       <a:off x="0" y="0"/>
-                      <a:ext cx="5669280" cy="2591038"/>
+                      <a:ext cx="5669280" cy="3543300"/>
                     </a:xfrm>
                     <a:prstGeom prst="rect"/>
                   </pic:spPr>
@@ -571,7 +571,7 @@
       <w:r>
         <w:drawing>
           <wp:inline xmlns:a="http://schemas.openxmlformats.org/drawingml/2006/main" xmlns:pic="http://schemas.openxmlformats.org/drawingml/2006/picture">
-            <wp:extent cx="5669280" cy="2591038"/>
+            <wp:extent cx="5669280" cy="3543300"/>
             <wp:docPr id="7" name="Picture 7"/>
             <wp:cNvGraphicFramePr>
               <a:graphicFrameLocks noChangeAspect="1"/>
@@ -592,7 +592,7 @@
                   <pic:spPr>
                     <a:xfrm>
                       <a:off x="0" y="0"/>
-                      <a:ext cx="5669280" cy="2591038"/>
+                      <a:ext cx="5669280" cy="3543300"/>
                     </a:xfrm>
                     <a:prstGeom prst="rect"/>
                   </pic:spPr>
@@ -1010,7 +1010,7 @@
       <w:r>
         <w:drawing>
           <wp:inline xmlns:a="http://schemas.openxmlformats.org/drawingml/2006/main" xmlns:pic="http://schemas.openxmlformats.org/drawingml/2006/picture">
-            <wp:extent cx="5669280" cy="2591038"/>
+            <wp:extent cx="5669280" cy="3543300"/>
             <wp:docPr id="8" name="Picture 8"/>
             <wp:cNvGraphicFramePr>
               <a:graphicFrameLocks noChangeAspect="1"/>
@@ -1031,7 +1031,7 @@
                   <pic:spPr>
                     <a:xfrm>
                       <a:off x="0" y="0"/>
-                      <a:ext cx="5669280" cy="2591038"/>
+                      <a:ext cx="5669280" cy="3543300"/>
                     </a:xfrm>
                     <a:prstGeom prst="rect"/>
                   </pic:spPr>

</xml_diff>